<commit_message>
chore: abbreviate CV education and experience dates
Co-Authored-By: Claude Opus 5.5 (1M context) <noreply@anthropic.com>
</commit_message>
<xml_diff>
--- a/static/assets/cv/CV-Junbo Lian.docx
+++ b/static/assets/cv/CV-Junbo Lian.docx
@@ -189,7 +189,7 @@
           <w:sz w:val="21"/>
           <w:szCs w:val="21"/>
         </w:rPr>
-        <w:t xml:space="preserve">	January 2027 – (expected)</w:t>
+        <w:t xml:space="preserve">	Jan 2027 – (expected)</w:t>
       </w:r>
     </w:p>
     <w:p>
@@ -263,7 +263,7 @@
           <w:sz w:val="21"/>
           <w:szCs w:val="21"/>
         </w:rPr>
-        <w:t xml:space="preserve">	September 2025 – December 2026</w:t>
+        <w:t xml:space="preserve">	Sep 2025 – Dec 2026</w:t>
       </w:r>
     </w:p>
     <w:p>
@@ -311,7 +311,7 @@
           <w:sz w:val="21"/>
           <w:szCs w:val="21"/>
         </w:rPr>
-        <w:t xml:space="preserve">	September 2021 – June 2025</w:t>
+        <w:t xml:space="preserve">	Sep 2021 – Jun 2025</w:t>
       </w:r>
     </w:p>
     <w:p>
@@ -964,7 +964,7 @@
           <w:sz w:val="21"/>
           <w:szCs w:val="21"/>
         </w:rPr>
-        <w:t xml:space="preserve">	January 2025 – present</w:t>
+        <w:t xml:space="preserve">	Jan 2025 – present</w:t>
       </w:r>
     </w:p>
     <w:p>
@@ -1086,7 +1086,7 @@
           <w:sz w:val="21"/>
           <w:szCs w:val="21"/>
         </w:rPr>
-        <w:t xml:space="preserve">	October 2022 – June 2024</w:t>
+        <w:t xml:space="preserve">	Oct 2022 – Jun 2024</w:t>
       </w:r>
     </w:p>
     <w:p>

</xml_diff>

<commit_message>
chore: update CV files
Co-Authored-By: Claude Opus 5.5 (1M context) <noreply@anthropic.com>
</commit_message>
<xml_diff>
--- a/static/assets/cv/CV-Junbo Lian.docx
+++ b/static/assets/cv/CV-Junbo Lian.docx
@@ -181,15 +181,7 @@
           <w:sz w:val="21"/>
           <w:szCs w:val="21"/>
         </w:rPr>
-        <w:t xml:space="preserve">, Singapore</w:t>
-      </w:r>
-      <w:r>
-        <w:rPr>
-          <w:rFonts w:ascii="Times New Roman" w:cs="Times New Roman" w:eastAsia="Times New Roman" w:hAnsi="Times New Roman"/>
-          <w:sz w:val="21"/>
-          <w:szCs w:val="21"/>
-        </w:rPr>
-        <w:t xml:space="preserve">	Jan 2027 – present</w:t>
+        <w:t xml:space="preserve">, Singapore	Jan 2027 – present</w:t>
       </w:r>
     </w:p>
     <w:p>
@@ -255,15 +247,7 @@
           <w:sz w:val="21"/>
           <w:szCs w:val="21"/>
         </w:rPr>
-        <w:t xml:space="preserve">, Evanston, IL, USA</w:t>
-      </w:r>
-      <w:r>
-        <w:rPr>
-          <w:rFonts w:ascii="Times New Roman" w:cs="Times New Roman" w:eastAsia="Times New Roman" w:hAnsi="Times New Roman"/>
-          <w:sz w:val="21"/>
-          <w:szCs w:val="21"/>
-        </w:rPr>
-        <w:t xml:space="preserve">	Sep 2025 – Dec 2026</w:t>
+        <w:t xml:space="preserve">, Evanston, IL, USA	Sep 2025 – Dec 2026</w:t>
       </w:r>
     </w:p>
     <w:p>
@@ -303,15 +287,7 @@
           <w:sz w:val="21"/>
           <w:szCs w:val="21"/>
         </w:rPr>
-        <w:t xml:space="preserve">, Hangzhou, China</w:t>
-      </w:r>
-      <w:r>
-        <w:rPr>
-          <w:rFonts w:ascii="Times New Roman" w:cs="Times New Roman" w:eastAsia="Times New Roman" w:hAnsi="Times New Roman"/>
-          <w:sz w:val="21"/>
-          <w:szCs w:val="21"/>
-        </w:rPr>
-        <w:t xml:space="preserve">	Sep 2021 – Jun 2025</w:t>
+        <w:t xml:space="preserve">, Hangzhou, China	Sep 2021 – Jun 2025</w:t>
       </w:r>
     </w:p>
     <w:p>
@@ -630,25 +606,25 @@
           <w:sz w:val="21"/>
           <w:szCs w:val="21"/>
         </w:rPr>
-        <w:t xml:space="preserve">, T. Zhu, L. Ma, X. Wu, A. A. Heidari, Y. Chen, H. Chen, G. Hui. 2024. The educational competition optimizer. </w:t>
-      </w:r>
-      <w:r>
-        <w:rPr>
-          <w:rFonts w:ascii="Times New Roman" w:cs="Times New Roman" w:eastAsia="Times New Roman" w:hAnsi="Times New Roman"/>
-          <w:i/>
-          <w:iCs/>
-          <w:sz w:val="21"/>
-          <w:szCs w:val="21"/>
-        </w:rPr>
-        <w:t xml:space="preserve">International Journal of Systems Science</w:t>
-      </w:r>
-      <w:r>
-        <w:rPr>
-          <w:rFonts w:ascii="Times New Roman" w:cs="Times New Roman" w:eastAsia="Times New Roman" w:hAnsi="Times New Roman"/>
-          <w:sz w:val="21"/>
-          <w:szCs w:val="21"/>
-        </w:rPr>
-        <w:t xml:space="preserve"> 55(15): 3185–3222.</w:t>
+        <w:t xml:space="preserve">, K. Ouyang, Y. Zhang, R. Zhong, H. Chen, Z. Zheng, Y. Sun, H. Chen. 2026. Competitive cluster elimination (CCE) for large-scale swarm optimization. </w:t>
+      </w:r>
+      <w:r>
+        <w:rPr>
+          <w:rFonts w:ascii="Times New Roman" w:cs="Times New Roman" w:eastAsia="Times New Roman" w:hAnsi="Times New Roman"/>
+          <w:i/>
+          <w:iCs/>
+          <w:sz w:val="21"/>
+          <w:szCs w:val="21"/>
+        </w:rPr>
+        <w:t xml:space="preserve">Applied Soft Computing</w:t>
+      </w:r>
+      <w:r>
+        <w:rPr>
+          <w:rFonts w:ascii="Times New Roman" w:cs="Times New Roman" w:eastAsia="Times New Roman" w:hAnsi="Times New Roman"/>
+          <w:sz w:val="21"/>
+          <w:szCs w:val="21"/>
+        </w:rPr>
+        <w:t xml:space="preserve">, forthcoming.</w:t>
       </w:r>
     </w:p>
     <w:p>
@@ -696,49 +672,6 @@
     </w:p>
     <w:p>
       <w:pPr>
-        <w:keepNext w:val="false"/>
-        <w:spacing w:after="60" w:before="0" w:line="252"/>
-        <w:ind w:left="360" w:hanging="360"/>
-      </w:pPr>
-      <w:r>
-        <w:rPr>
-          <w:rFonts w:ascii="Times New Roman" w:cs="Times New Roman" w:eastAsia="Times New Roman" w:hAnsi="Times New Roman"/>
-          <w:b/>
-          <w:bCs/>
-          <w:sz w:val="21"/>
-          <w:szCs w:val="21"/>
-        </w:rPr>
-        <w:t xml:space="preserve">Lian, J.</w:t>
-      </w:r>
-      <w:r>
-        <w:rPr>
-          <w:rFonts w:ascii="Times New Roman" w:cs="Times New Roman" w:eastAsia="Times New Roman" w:hAnsi="Times New Roman"/>
-          <w:sz w:val="21"/>
-          <w:szCs w:val="21"/>
-        </w:rPr>
-        <w:t xml:space="preserve">, G. Hui. 2024. Human evolutionary optimization algorithm. </w:t>
-      </w:r>
-      <w:r>
-        <w:rPr>
-          <w:rFonts w:ascii="Times New Roman" w:cs="Times New Roman" w:eastAsia="Times New Roman" w:hAnsi="Times New Roman"/>
-          <w:i/>
-          <w:iCs/>
-          <w:sz w:val="21"/>
-          <w:szCs w:val="21"/>
-        </w:rPr>
-        <w:t xml:space="preserve">Expert Systems with Applications</w:t>
-      </w:r>
-      <w:r>
-        <w:rPr>
-          <w:rFonts w:ascii="Times New Roman" w:cs="Times New Roman" w:eastAsia="Times New Roman" w:hAnsi="Times New Roman"/>
-          <w:sz w:val="21"/>
-          <w:szCs w:val="21"/>
-        </w:rPr>
-        <w:t xml:space="preserve"> 241: 122638.</w:t>
-      </w:r>
-    </w:p>
-    <w:p>
-      <w:pPr>
         <w:spacing w:after="20" w:before="0" w:line="252"/>
       </w:pPr>
       <w:r>
@@ -749,7 +682,7 @@
           <w:sz w:val="20"/>
           <w:szCs w:val="20"/>
         </w:rPr>
-        <w:t xml:space="preserve">Other journal articles in evolutionary computation, deep learning, and food engineering are listed on Google Scholar.</w:t>
+        <w:t xml:space="preserve">A complete list of publications is available on Google Scholar.</w:t>
       </w:r>
     </w:p>
     <w:p>
@@ -785,15 +718,7 @@
           <w:sz w:val="21"/>
           <w:szCs w:val="21"/>
         </w:rPr>
-        <w:t xml:space="preserve">Gold Medal, 19th “Challenge Cup” Science and Technology Works Competition, Zhejiang Province</w:t>
-      </w:r>
-      <w:r>
-        <w:rPr>
-          <w:rFonts w:ascii="Times New Roman" w:cs="Times New Roman" w:eastAsia="Times New Roman" w:hAnsi="Times New Roman"/>
-          <w:sz w:val="21"/>
-          <w:szCs w:val="21"/>
-        </w:rPr>
-        <w:t xml:space="preserve">	2025</w:t>
+        <w:t xml:space="preserve">Gold Medal, 19th “Challenge Cup” Science and Technology Works Competition, Zhejiang Province	2025</w:t>
       </w:r>
     </w:p>
     <w:p>
@@ -810,15 +735,7 @@
           <w:sz w:val="21"/>
           <w:szCs w:val="21"/>
         </w:rPr>
-        <w:t xml:space="preserve">First Prize, National Big Data Challenge Competition of College Students</w:t>
-      </w:r>
-      <w:r>
-        <w:rPr>
-          <w:rFonts w:ascii="Times New Roman" w:cs="Times New Roman" w:eastAsia="Times New Roman" w:hAnsi="Times New Roman"/>
-          <w:sz w:val="21"/>
-          <w:szCs w:val="21"/>
-        </w:rPr>
-        <w:t xml:space="preserve">	2022</w:t>
+        <w:t xml:space="preserve">First Prize, National Big Data Challenge Competition of College Students	2022</w:t>
       </w:r>
     </w:p>
     <w:p>
@@ -835,15 +752,7 @@
           <w:sz w:val="21"/>
           <w:szCs w:val="21"/>
         </w:rPr>
-        <w:t xml:space="preserve">Two ESI Hot Papers (top 0.1%) and four ESI Highly Cited Papers (top 1%), Clarivate</w:t>
-      </w:r>
-      <w:r>
-        <w:rPr>
-          <w:rFonts w:ascii="Times New Roman" w:cs="Times New Roman" w:eastAsia="Times New Roman" w:hAnsi="Times New Roman"/>
-          <w:sz w:val="21"/>
-          <w:szCs w:val="21"/>
-        </w:rPr>
-        <w:t xml:space="preserve">	2024–2026</w:t>
+        <w:t xml:space="preserve">Two ESI Hot Papers (top 0.1%) and four ESI Highly Cited Papers (top 1%), Clarivate	2024–2026</w:t>
       </w:r>
     </w:p>
     <w:p>
@@ -878,15 +787,7 @@
           <w:sz w:val="21"/>
           <w:szCs w:val="21"/>
         </w:rPr>
-        <w:t xml:space="preserve">Conference on Neural Information Processing Systems (NeurIPS), poster</w:t>
-      </w:r>
-      <w:r>
-        <w:rPr>
-          <w:rFonts w:ascii="Times New Roman" w:cs="Times New Roman" w:eastAsia="Times New Roman" w:hAnsi="Times New Roman"/>
-          <w:sz w:val="21"/>
-          <w:szCs w:val="21"/>
-        </w:rPr>
-        <w:t xml:space="preserve">	2026</w:t>
+        <w:t xml:space="preserve">Conference on Neural Information Processing Systems (NeurIPS), poster	2026</w:t>
       </w:r>
     </w:p>
     <w:p>
@@ -902,15 +803,7 @@
           <w:sz w:val="21"/>
           <w:szCs w:val="21"/>
         </w:rPr>
-        <w:t xml:space="preserve">POMS International Conference in China, Xi'an</w:t>
-      </w:r>
-      <w:r>
-        <w:rPr>
-          <w:rFonts w:ascii="Times New Roman" w:cs="Times New Roman" w:eastAsia="Times New Roman" w:hAnsi="Times New Roman"/>
-          <w:sz w:val="21"/>
-          <w:szCs w:val="21"/>
-        </w:rPr>
-        <w:t xml:space="preserve">	2026</w:t>
+        <w:t xml:space="preserve">POMS International Conference in China, Xi'an	2026</w:t>
       </w:r>
     </w:p>
     <w:p>
@@ -956,15 +849,7 @@
           <w:sz w:val="21"/>
           <w:szCs w:val="21"/>
         </w:rPr>
-        <w:t xml:space="preserve">, Wenzhou, China</w:t>
-      </w:r>
-      <w:r>
-        <w:rPr>
-          <w:rFonts w:ascii="Times New Roman" w:cs="Times New Roman" w:eastAsia="Times New Roman" w:hAnsi="Times New Roman"/>
-          <w:sz w:val="21"/>
-          <w:szCs w:val="21"/>
-        </w:rPr>
-        <w:t xml:space="preserve">	Jan 2025 – present</w:t>
+        <w:t xml:space="preserve">, Wenzhou, China	Jan 2025 – present</w:t>
       </w:r>
     </w:p>
     <w:p>
@@ -1078,15 +963,7 @@
           <w:sz w:val="21"/>
           <w:szCs w:val="21"/>
         </w:rPr>
-        <w:t xml:space="preserve">, Hangzhou, China</w:t>
-      </w:r>
-      <w:r>
-        <w:rPr>
-          <w:rFonts w:ascii="Times New Roman" w:cs="Times New Roman" w:eastAsia="Times New Roman" w:hAnsi="Times New Roman"/>
-          <w:sz w:val="21"/>
-          <w:szCs w:val="21"/>
-        </w:rPr>
-        <w:t xml:space="preserve">	Oct 2022 – Jun 2024</w:t>
+        <w:t xml:space="preserve">, Hangzhou, China	Oct 2022 – Jun 2024</w:t>
       </w:r>
     </w:p>
     <w:p>

</xml_diff>